<commit_message>
docs: stop the handover reading as though XAMPP were part of the system
XAMPP is on the box for other work and holds none of this system's
data - MySQL runs as its own service. The old note said HygienePro
does not use XAMPP's php.ini, but saying it inside the environment
section still left XAMPP looking like something you would install to
stand this up.

It now sits under a heading that says what it is: software on the same
machine that this system does not use, beside e-contract and
asset-control. Somebody rebuilding the server needs MySQL, IIS and
C:\PHP, and nothing else.

Kept rather than dropped because the trap is real: two php.ini files
on one machine, and editing the wrong one changes nothing while
looking like it should have.

Co-Authored-By: Claude Opus 5 <noreply@anthropic.com>
</commit_message>
<xml_diff>
--- a/docs/เอกสารส่งมอบระบบ HygienePro.docx
+++ b/docs/เอกสารส่งมอบระบบ HygienePro.docx
@@ -783,7 +783,7 @@
                 <w:rFonts w:ascii="Tahoma" w:hAnsi="Tahoma" w:cs="Tahoma" w:eastAsia="Tahoma"/>
                 <w:sz w:val="19"/>
               </w:rPr>
-              <w:t>MySQL — ฐานข้อมูลชื่อ hygiene_db (127.0.0.1:3306)</w:t>
+              <w:t>MySQL (บริการแยกต่างหาก ไม่ใช่ของ XAMPP) — ฐานข้อมูลชื่อ hygiene_db ที่ 127.0.0.1:3306</w:t>
             </w:r>
           </w:p>
         </w:tc>
@@ -890,6 +890,150 @@
         <w:spacing w:after="40"/>
       </w:pPr>
     </w:p>
+    <w:p>
+      <w:pPr>
+        <w:pStyle w:val="Heading2"/>
+      </w:pPr>
+      <w:r>
+        <w:rPr>
+          <w:rFonts w:ascii="Tahoma" w:hAnsi="Tahoma" w:cs="Tahoma" w:eastAsia="Tahoma"/>
+          <w:b/>
+          <w:color w:val="1F4E79"/>
+          <w:sz w:val="25"/>
+        </w:rPr>
+        <w:t>2.1 สิ่งที่อยู่บนเครื่องเดียวกันแต่ไม่เกี่ยวข้องกับระบบนี้</w:t>
+      </w:r>
+    </w:p>
+    <w:p>
+      <w:pPr>
+        <w:spacing w:after="120"/>
+      </w:pPr>
+      <w:r>
+        <w:rPr>
+          <w:rFonts w:ascii="Tahoma" w:hAnsi="Tahoma" w:cs="Tahoma" w:eastAsia="Tahoma"/>
+          <w:b w:val="0"/>
+          <w:sz w:val="21"/>
+        </w:rPr>
+        <w:t>เครื่อง 192.168.1.201 มีระบบงานอื่นติดตั้งอยู่ด้วย รายการต่อไปนี้ไม่ใช่ส่วนหนึ่งของ HygienePro และไม่ต้องติดตั้งเพิ่มเมื่อย้ายเครื่อง บันทึกไว้เพื่อไม่ให้แก้ผิดที่</w:t>
+      </w:r>
+    </w:p>
+    <w:tbl>
+      <w:tblPr>
+        <w:tblStyle w:val="TableGrid"/>
+        <w:tblW w:type="auto" w:w="0"/>
+        <w:jc w:val="left"/>
+        <w:tblLook w:firstColumn="1" w:firstRow="1" w:lastColumn="0" w:lastRow="0" w:noHBand="0" w:noVBand="1" w:val="04A0"/>
+      </w:tblPr>
+      <w:tblGrid>
+        <w:gridCol w:w="4320"/>
+        <w:gridCol w:w="4320"/>
+      </w:tblGrid>
+      <w:tr>
+        <w:tc>
+          <w:tcPr>
+            <w:tcW w:type="dxa" w:w="2835"/>
+            <w:shd w:val="clear" w:fill="DCE6F1"/>
+          </w:tcPr>
+          <w:p>
+            <w:r/>
+            <w:r>
+              <w:rPr>
+                <w:rFonts w:ascii="Tahoma" w:hAnsi="Tahoma" w:cs="Tahoma" w:eastAsia="Tahoma"/>
+                <w:b/>
+                <w:sz w:val="19"/>
+              </w:rPr>
+              <w:t>สิ่งที่อยู่บนเครื่อง</w:t>
+            </w:r>
+          </w:p>
+        </w:tc>
+        <w:tc>
+          <w:tcPr>
+            <w:tcW w:type="dxa" w:w="6236"/>
+            <w:shd w:val="clear" w:fill="DCE6F1"/>
+          </w:tcPr>
+          <w:p>
+            <w:r/>
+            <w:r>
+              <w:rPr>
+                <w:rFonts w:ascii="Tahoma" w:hAnsi="Tahoma" w:cs="Tahoma" w:eastAsia="Tahoma"/>
+                <w:b/>
+                <w:sz w:val="19"/>
+              </w:rPr>
+              <w:t>เกี่ยวข้องกับ HygienePro หรือไม่</w:t>
+            </w:r>
+          </w:p>
+        </w:tc>
+      </w:tr>
+      <w:tr>
+        <w:tc>
+          <w:tcPr>
+            <w:tcW w:type="dxa" w:w="2835"/>
+          </w:tcPr>
+          <w:p>
+            <w:r/>
+            <w:r>
+              <w:rPr>
+                <w:rFonts w:ascii="Tahoma" w:hAnsi="Tahoma" w:cs="Tahoma" w:eastAsia="Tahoma"/>
+                <w:sz w:val="19"/>
+              </w:rPr>
+              <w:t>XAMPP (Apache + PHP + MariaDB)</w:t>
+            </w:r>
+          </w:p>
+        </w:tc>
+        <w:tc>
+          <w:tcPr>
+            <w:tcW w:type="dxa" w:w="6236"/>
+          </w:tcPr>
+          <w:p>
+            <w:r/>
+            <w:r>
+              <w:rPr>
+                <w:rFonts w:ascii="Tahoma" w:hAnsi="Tahoma" w:cs="Tahoma" w:eastAsia="Tahoma"/>
+                <w:sz w:val="19"/>
+              </w:rPr>
+              <w:t>ไม่เกี่ยวข้อง — HygienePro ใช้ IIS กับ C:\PHP และใช้ MySQL บริการแยกต่างหาก การแก้ค่า PHP ต้องแก้ที่ C:\PHP\php.ini เท่านั้น ไม่ใช่ C:\xampp\php\php.ini</w:t>
+            </w:r>
+          </w:p>
+        </w:tc>
+      </w:tr>
+      <w:tr>
+        <w:tc>
+          <w:tcPr>
+            <w:tcW w:type="dxa" w:w="2835"/>
+          </w:tcPr>
+          <w:p>
+            <w:r/>
+            <w:r>
+              <w:rPr>
+                <w:rFonts w:ascii="Tahoma" w:hAnsi="Tahoma" w:cs="Tahoma" w:eastAsia="Tahoma"/>
+                <w:sz w:val="19"/>
+              </w:rPr>
+              <w:t>e-contract และ asset-control</w:t>
+            </w:r>
+          </w:p>
+        </w:tc>
+        <w:tc>
+          <w:tcPr>
+            <w:tcW w:type="dxa" w:w="6236"/>
+          </w:tcPr>
+          <w:p>
+            <w:r/>
+            <w:r>
+              <w:rPr>
+                <w:rFonts w:ascii="Tahoma" w:hAnsi="Tahoma" w:cs="Tahoma" w:eastAsia="Tahoma"/>
+                <w:sz w:val="19"/>
+              </w:rPr>
+              <w:t>ไม่เกี่ยวข้อง — เป็นคนละระบบ แต่ใช้ PHP ตัวเดียวกัน จึงต้องระวังเมื่อแก้ php.ini</w:t>
+            </w:r>
+          </w:p>
+        </w:tc>
+      </w:tr>
+    </w:tbl>
+    <w:p>
+      <w:pPr>
+        <w:spacing w:after="40"/>
+      </w:pPr>
+    </w:p>
     <w:tbl>
       <w:tblPr>
         <w:tblStyle w:val="TableGrid"/>
@@ -912,7 +1056,7 @@
                 <w:rFonts w:ascii="Tahoma" w:hAnsi="Tahoma" w:cs="Tahoma" w:eastAsia="Tahoma"/>
                 <w:sz w:val="19"/>
               </w:rPr>
-              <w:t>หมายเหตุสำคัญ: เครื่องนี้มี XAMPP ติดตั้งอยู่ด้วย แต่ HygienePro ไม่ได้ใช้ C:\xampp\php\php.ini การแก้ไขค่า PHP ต้องแก้ที่ C:\PHP\php.ini เท่านั้น</w:t>
+              <w:t>ข้อควรระวังเมื่อย้ายเครื่องหรือติดตั้งใหม่: ต้องเตรียม MySQL, IIS และ C:\PHP เท่านั้น ไม่ต้องติดตั้ง XAMPP</w:t>
             </w:r>
           </w:p>
         </w:tc>

</xml_diff>